<commit_message>
Link the v1.2.1 Zenodo archive
</commit_message>
<xml_diff>
--- a/manuscript/Leakage_Aware_SMO_SVM_Manuscript_JBI_v1.2.1.docx
+++ b/manuscript/Leakage_Aware_SMO_SVM_Manuscript_JBI_v1.2.1.docx
@@ -3175,7 +3175,7 @@
         <w:rPr>
           <w:rtl w:val="0"/>
         </w:rPr>
-        <w:t>The analysis was designed for reproducibility by recording data-accession sources, preprocessing decisions, random seeds, fold assignments, selected-feature lists, software environment information, and audit tables. A prior project snapshot is Zenodo DOI 10.5281/zenodo.21134086. The synchronized v1.2.1 code, results, metadata, figures, supplements, and manuscript are archived as a versioned release under Zenodo concept DOI 10.5281/zenodo.21134085. The corrected permutation analysis refits both complete workflows after every label shuffle. Supplementary File S4 reports the software environment, and Supplementary File S5 provides the evidence-audit dashboard.</w:t>
+        <w:t>The analysis was designed for reproducibility by recording data-accession sources, preprocessing decisions, random seeds, fold assignments, selected-feature lists, software environment information, and audit tables. A prior project snapshot is Zenodo DOI 10.5281/zenodo.21134086. The synchronized v1.2.1 code, results, metadata, figures, supplements, and manuscript are archived at Zenodo, version DOI 10.5281/zenodo.21840371 (concept DOI 10.5281/zenodo.21134085). The corrected permutation analysis refits both complete workflows after every label shuffle. Supplementary File S4 reports the software environment, and Supplementary File S5 provides the evidence-audit dashboard.</w:t>
       </w:r>
       <w:r>
         <w:rPr>
@@ -12905,7 +12905,7 @@
               <w:rPr>
                 <w:rtl w:val="0"/>
               </w:rPr>
-              <w:t>Submission-aligned v1.2.1 is archived as a versioned release under Zenodo concept DOI 10.5281/zenodo.21134085; DOI 10.5281/zenodo.21834590 is the previous v1.2.0 release and DOI 10.5281/zenodo.21134086 is an earlier snapshot.</w:t>
+              <w:t>Submission-aligned v1.2.1 is archived at Zenodo, version DOI 10.5281/zenodo.21840371 (concept DOI 10.5281/zenodo.21134085); DOI 10.5281/zenodo.21834590 is the previous v1.2.0 release and DOI 10.5281/zenodo.21134086 is an earlier snapshot.</w:t>
             </w:r>
             <w:r>
               <w:rPr>
@@ -14635,7 +14635,7 @@
         <w:rPr>
           <w:rtl w:val="0"/>
         </w:rPr>
-        <w:t>The datasets analyzed are publicly available from the NCBI Gene Expression Omnibus under accessions GSE25055, GSE25065, GSE41998, GSE20194, and GSE20271. Cohort roles and exclusion decisions are described in the Methods, Results, and Supplementary File S1. The submission-aligned analysis code, reproducibility materials, figures, tables, supplements, and manuscript are hosted in the public GitHub repository (https://github.com/iry496/leakage-aware-smo-svm-omics; code under the MIT license, manuscript-derived materials under CC-BY-4.0) and archived as version v1.2.1 under Zenodo concept DOI 10.5281/zenodo.21134085. No new data were generated by this study.</w:t>
+        <w:t>The datasets analyzed are publicly available from the NCBI Gene Expression Omnibus under accessions GSE25055, GSE25065, GSE41998, GSE20194, and GSE20271. Cohort roles and exclusion decisions are described in the Methods, Results, and Supplementary File S1. The submission-aligned analysis code, reproducibility materials, figures, tables, supplements, and manuscript are hosted in the public GitHub repository (https://github.com/iry496/leakage-aware-smo-svm-omics; code under the MIT license, manuscript-derived materials under CC-BY-4.0) and archived at Zenodo as version v1.2.1, DOI 10.5281/zenodo.21840371 (concept DOI 10.5281/zenodo.21134085). No new data were generated by this study.</w:t>
       </w:r>
       <w:r>
         <w:rPr>
@@ -14692,7 +14692,7 @@
         <w:rPr>
           <w:rtl w:val="0"/>
         </w:rPr>
-        <w:t>Project name: Reproducible Omics Evidence Audit. Project home page: https://github.com/iry496/leakage-aware-smo-svm-omics. Versioned archive: v1.2.1 under Zenodo concept DOI 10.5281/zenodo.21134085. Programming language: R. License: MIT for code and CC-BY-4.0 for manuscript-derived materials. The executed software environment is reported in Supplementary File S4.</w:t>
+        <w:t>Project name: Reproducible Omics Evidence Audit. Project home page: https://github.com/iry496/leakage-aware-smo-svm-omics. Versioned archive: v1.2.1, Zenodo DOI 10.5281/zenodo.21840371 (concept DOI 10.5281/zenodo.21134085). Programming language: R. License: MIT for code and CC-BY-4.0 for manuscript-derived materials. The executed software environment is reported in Supplementary File S4.</w:t>
       </w:r>
       <w:r>
         <w:rPr>

</xml_diff>